<commit_message>
Update phone number and fix dark-mode color toggle
</commit_message>
<xml_diff>
--- a/Fawaz_Aljathnan_People_Practice.docx
+++ b/Fawaz_Aljathnan_People_Practice.docx
@@ -28,7 +28,21 @@
           <w:rFonts w:asciiTheme="minorBidi" w:hAnsiTheme="minorBidi"/>
           <w:color w:val="000000" w:themeColor="text1"/>
         </w:rPr>
-        <w:t>Phone: +966 58 244 4499 | Email: FawazSalehQ@gmail.com | Location: Saudi Arabia | LinkedIn: linkedin.com/in/fawazsalehq</w:t>
+        <w:t>Phone: +966 5</w:t>
+      </w:r>
+      <w:r>
+        <w:rPr>
+          <w:rFonts w:asciiTheme="minorBidi" w:hAnsiTheme="minorBidi"/>
+          <w:color w:val="000000" w:themeColor="text1"/>
+        </w:rPr>
+        <w:t>8 033 3254</w:t>
+      </w:r>
+      <w:r>
+        <w:rPr>
+          <w:rFonts w:asciiTheme="minorBidi" w:hAnsiTheme="minorBidi"/>
+          <w:color w:val="000000" w:themeColor="text1"/>
+        </w:rPr>
+        <w:t xml:space="preserve"> | Email: FawazSalehQ@gmail.com | Location: Saudi Arabia | LinkedIn: linkedin.com/in/fawazsalehq</w:t>
       </w:r>
     </w:p>
     <w:p>

</xml_diff>